<commit_message>
docs: unify project title across all deliverables
Set the project title to "Uncertainty-Aware Hybrid CNN Ensemble for
Four-Class Acute Lymphoblastic Leukemia Subtyping with MC Dropout"
(matching the IEEE paper) in the project report (cover, certificate,
metadata), the HOW_IT_WORKS cover (PDF + DOCX), and the slide-deck cover.
Only the title text changed; no numbers, results, citations, authors or
layout. Regenerated project_report.pdf, HOW_IT_WORKS.pdf/.docx; edited the
docx/pptx covers in place (no build script exists for those).

Co-Authored-By: Claude Opus 4.8 <noreply@anthropic.com>
</commit_message>
<xml_diff>
--- a/docs/project_report.docx
+++ b/docs/project_report.docx
@@ -26,7 +26,7 @@
           <w:b/>
           <w:sz w:val="34"/>
         </w:rPr>
-        <w:t>Blood Cancer Identification using Hybrid Ensemble Deep Learning with Monte Carlo Dropout Uncertainty Quantification</w:t>
+        <w:t>Uncertainty-Aware Hybrid CNN Ensemble for Four-Class Acute Lymphoblastic Leukemia Subtyping with MC Dropout</w:t>
       </w:r>
     </w:p>
     <w:p>
@@ -289,7 +289,7 @@
           <w:i w:val="0"/>
           <w:sz w:val="24"/>
         </w:rPr>
-        <w:t>Blood Cancer Identification using Hybrid Ensemble Deep Learning with Monte Carlo Dropout Uncertainty Quantification</w:t>
+        <w:t>Uncertainty-Aware Hybrid CNN Ensemble for Four-Class Acute Lymphoblastic Leukemia Subtyping with MC Dropout</w:t>
       </w:r>
       <w:r>
         <w:rPr>

</xml_diff>